<commit_message>
revision updates from LGS
</commit_message>
<xml_diff>
--- a/manuscript/resubmission/Sullivan et al. Review Response.docx
+++ b/manuscript/resubmission/Sullivan et al. Review Response.docx
@@ -12,7 +12,43 @@
         <w:rPr>
           <w:color w:val="212121"/>
         </w:rPr>
-        <w:t>We appreciate the thoughtful comments by the editor and the reviewers.  We have revised our manuscript accordingly and have addressed all concerns listed below.  We include the main points we have changed that were concerns that ran throughout all the reviews, as well as all individual comments.  We also include a direct response to each comment below.</w:t>
+        <w:t xml:space="preserve">We appreciate the thoughtful comments by the editor and the reviewers.  We have revised our manuscript accordingly and have addressed all concerns listed below.  </w:t>
+      </w:r>
+      <w:r>
+        <w:rPr>
+          <w:color w:val="212121"/>
+        </w:rPr>
+        <w:t>Below we describe</w:t>
+      </w:r>
+      <w:r>
+        <w:rPr>
+          <w:color w:val="212121"/>
+        </w:rPr>
+        <w:t xml:space="preserve"> the </w:t>
+      </w:r>
+      <w:r>
+        <w:rPr>
+          <w:color w:val="212121"/>
+        </w:rPr>
+        <w:t xml:space="preserve">major </w:t>
+      </w:r>
+      <w:r>
+        <w:rPr>
+          <w:color w:val="212121"/>
+        </w:rPr>
+        <w:t xml:space="preserve">points </w:t>
+      </w:r>
+      <w:r>
+        <w:rPr>
+          <w:color w:val="212121"/>
+        </w:rPr>
+        <w:t>that we have addressed</w:t>
+      </w:r>
+      <w:r>
+        <w:rPr>
+          <w:color w:val="212121"/>
+        </w:rPr>
+        <w:t>.  We also include a direct response to each comment below.</w:t>
       </w:r>
     </w:p>
     <w:p>
@@ -105,7 +141,13 @@
         <w:rPr>
           <w:color w:val="212121"/>
         </w:rPr>
-        <w:t xml:space="preserve"> the novel seeds that fall onto the carpets.  This seed rain capture provides a metric of the seeds falling to the ground.  However, if we were to perform capture studies in the field comparing the artificial turf and the sticky traps, we could not ensure we had equal seed fall across all traps to assess capture, and thus an experimental design that focused on capture would not provide the data necessary for researchers to make decisions about which trap types they should use to make sure they were adequately defining capture.  Instead, here we perform a “recovery” experiment.  Recovery is defined as the number of seeds we </w:t>
+        <w:t xml:space="preserve"> the novel seeds that fall onto the carpets.  This seed rain capture provides a metric of the seeds falling to the ground.  However, if we were to perform capture studies in the field comparing the artificial turf and the sticky traps, we could not ensure we had equal seed fall across all traps to assess capture, and thus an experimental design that focused on capture would not provide the data necessary for researchers to make decisions about which trap types they should use to make sure they were </w:t>
+      </w:r>
+      <w:r>
+        <w:rPr>
+          <w:color w:val="212121"/>
+        </w:rPr>
+        <w:t xml:space="preserve">adequately defining capture.  Instead, here we perform a “recovery” experiment.  Recovery is defined as the number of seeds we </w:t>
       </w:r>
       <w:proofErr w:type="gramStart"/>
       <w:r>
@@ -119,7 +161,31 @@
         <w:rPr>
           <w:color w:val="212121"/>
         </w:rPr>
-        <w:t xml:space="preserve"> successfully recover from the traps after a given amount of time after placing an equivalent number of seeds on each trap. Recovery allows us to validate how likely we are to find and identify </w:t>
+        <w:t xml:space="preserve"> successfully recover from the traps after a given amount of time after placing </w:t>
+      </w:r>
+      <w:r>
+        <w:rPr>
+          <w:color w:val="212121"/>
+        </w:rPr>
+        <w:t>a known</w:t>
+      </w:r>
+      <w:r>
+        <w:rPr>
+          <w:color w:val="212121"/>
+        </w:rPr>
+        <w:t xml:space="preserve"> number of seeds </w:t>
+      </w:r>
+      <w:r>
+        <w:rPr>
+          <w:color w:val="212121"/>
+        </w:rPr>
+        <w:t xml:space="preserve">of each species </w:t>
+      </w:r>
+      <w:r>
+        <w:rPr>
+          <w:color w:val="212121"/>
+        </w:rPr>
+        <w:t xml:space="preserve">on each trap. Recovery allows us to validate how likely we are to find and identify </w:t>
       </w:r>
       <w:r>
         <w:rPr>
@@ -134,6 +200,38 @@
         </w:rPr>
         <w:t xml:space="preserve"> seeds on the traps, and how long seeds remain in that location through time.</w:t>
       </w:r>
+      <w:r>
+        <w:rPr>
+          <w:color w:val="212121"/>
+        </w:rPr>
+        <w:t xml:space="preserve"> Thus, </w:t>
+      </w:r>
+      <w:r>
+        <w:rPr>
+          <w:color w:val="212121"/>
+        </w:rPr>
+        <w:t>we</w:t>
+      </w:r>
+      <w:r>
+        <w:rPr>
+          <w:color w:val="212121"/>
+        </w:rPr>
+        <w:t xml:space="preserve"> need to quantify recovery </w:t>
+      </w:r>
+      <w:proofErr w:type="gramStart"/>
+      <w:r>
+        <w:rPr>
+          <w:color w:val="212121"/>
+        </w:rPr>
+        <w:t>in order to</w:t>
+      </w:r>
+      <w:proofErr w:type="gramEnd"/>
+      <w:r>
+        <w:rPr>
+          <w:color w:val="212121"/>
+        </w:rPr>
+        <w:t xml:space="preserve"> feel confident in our trap types should they be used for capture studies in the future</w:t>
+      </w:r>
     </w:p>
     <w:p>
       <w:pPr>
@@ -154,21 +252,43 @@
         <w:rPr>
           <w:color w:val="212121"/>
         </w:rPr>
-        <w:t xml:space="preserve">We acknowledge that this distinction between recovery and capture was not clear in our previous version of the manuscript, and that we need to quantify recovery </w:t>
-      </w:r>
-      <w:proofErr w:type="gramStart"/>
-      <w:r>
-        <w:rPr>
-          <w:color w:val="212121"/>
-        </w:rPr>
-        <w:t>in order to</w:t>
-      </w:r>
-      <w:proofErr w:type="gramEnd"/>
-      <w:r>
-        <w:rPr>
-          <w:color w:val="212121"/>
-        </w:rPr>
-        <w:t xml:space="preserve"> feel confident in our trap types should they be used for capture studies in the future.   We have now attempted to clarify this in the intro and methods. To do this, we have made several changes:</w:t>
+        <w:t>We acknowledge that this distinction between recovery and capture was not clear in our previous version of the manuscript</w:t>
+      </w:r>
+      <w:r>
+        <w:rPr>
+          <w:color w:val="212121"/>
+        </w:rPr>
+        <w:t>.</w:t>
+      </w:r>
+      <w:r>
+        <w:rPr>
+          <w:color w:val="212121"/>
+        </w:rPr>
+        <w:t xml:space="preserve"> </w:t>
+      </w:r>
+      <w:r>
+        <w:rPr>
+          <w:color w:val="212121"/>
+        </w:rPr>
+        <w:t>W</w:t>
+      </w:r>
+      <w:r>
+        <w:rPr>
+          <w:color w:val="212121"/>
+        </w:rPr>
+        <w:t>e have made several changes</w:t>
+      </w:r>
+      <w:r>
+        <w:rPr>
+          <w:color w:val="212121"/>
+        </w:rPr>
+        <w:t xml:space="preserve"> to address reviewer comments</w:t>
+      </w:r>
+      <w:r>
+        <w:rPr>
+          <w:color w:val="212121"/>
+        </w:rPr>
+        <w:t>:</w:t>
       </w:r>
     </w:p>
     <w:p>
@@ -188,35 +308,121 @@
         <w:ind w:left="1350"/>
         <w:rPr>
           <w:color w:val="212121"/>
-          <w:highlight w:val="yellow"/>
-        </w:rPr>
-      </w:pPr>
-      <w:r>
-        <w:rPr>
-          <w:color w:val="212121"/>
-        </w:rPr>
-        <w:t xml:space="preserve">We have defined capture as “These traps are considered to measure “seed capture”, as traps are empty when placed in the field, and seeds that fall into the traps are captured and measured when traps are removed.” </w:t>
-      </w:r>
-      <w:r>
-        <w:rPr>
-          <w:color w:val="212121"/>
-          <w:highlight w:val="yellow"/>
-        </w:rPr>
-        <w:t xml:space="preserve">on lines 79-80 and </w:t>
-      </w:r>
-      <w:r>
-        <w:rPr>
-          <w:color w:val="212121"/>
-        </w:rPr>
-        <w:t>we have gone through the introduction and changed all mentions of recovery to capture when appropriate based on our definitions above.</w:t>
-      </w:r>
-      <w:r>
-        <w:rPr>
-          <w:color w:val="212121"/>
-          <w:highlight w:val="yellow"/>
-        </w:rPr>
-        <w:t xml:space="preserve"> </w:t>
-      </w:r>
+        </w:rPr>
+      </w:pPr>
+      <w:r>
+        <w:rPr>
+          <w:color w:val="212121"/>
+        </w:rPr>
+        <w:t>We have defined capture as “</w:t>
+      </w:r>
+      <w:r>
+        <w:t>These traps are considered to measure “seed capture”, as traps are empty when placed in the field, and seeds that fall into the traps from the surrounding community are captured and measured when traps are removed</w:t>
+      </w:r>
+      <w:r>
+        <w:rPr>
+          <w:color w:val="212121"/>
+        </w:rPr>
+        <w:t>.” on lines 79-8</w:t>
+      </w:r>
+      <w:r>
+        <w:rPr>
+          <w:color w:val="212121"/>
+        </w:rPr>
+        <w:t>1</w:t>
+      </w:r>
+      <w:r>
+        <w:rPr>
+          <w:color w:val="212121"/>
+        </w:rPr>
+        <w:t xml:space="preserve"> and we have gone through the introduction and changed all mentions of recovery to capture when appropriate </w:t>
+      </w:r>
+      <w:r>
+        <w:rPr>
+          <w:color w:val="212121"/>
+        </w:rPr>
+        <w:t xml:space="preserve">based on our definitions above. </w:t>
+      </w:r>
+    </w:p>
+    <w:p>
+      <w:pPr>
+        <w:ind w:left="1350"/>
+        <w:rPr>
+          <w:color w:val="212121"/>
+        </w:rPr>
+      </w:pPr>
+    </w:p>
+    <w:p>
+      <w:pPr>
+        <w:numPr>
+          <w:ilvl w:val="0"/>
+          <w:numId w:val="1"/>
+        </w:numPr>
+        <w:spacing w:line="240" w:lineRule="auto"/>
+        <w:ind w:left="1354"/>
+        <w:rPr>
+          <w:color w:val="212121"/>
+        </w:rPr>
+      </w:pPr>
+      <w:r>
+        <w:rPr>
+          <w:color w:val="212121"/>
+        </w:rPr>
+        <w:t>We have included reference to a paper where we quantified seed capture with these carpets  “</w:t>
+      </w:r>
+      <w:r>
+        <w:t xml:space="preserve">For example, recently Wynne et al. (2024) used artificial grass carpets for capturing seed rain in a successional </w:t>
+      </w:r>
+      <w:proofErr w:type="spellStart"/>
+      <w:r>
+        <w:t>chronosequence</w:t>
+      </w:r>
+      <w:proofErr w:type="spellEnd"/>
+      <w:r>
+        <w:t xml:space="preserve"> of temperate tallgrass prairies and were able to identify </w:t>
+      </w:r>
+      <w:r>
+        <w:rPr>
+          <w:rFonts w:ascii="Cambria Math" w:hAnsi="Cambria Math" w:cs="Cambria Math"/>
+        </w:rPr>
+        <w:t>∼</w:t>
+      </w:r>
+      <w:r>
+        <w:t>27,000-124,000 seeds per square meter depending on the age of the grassland</w:t>
+      </w:r>
+      <w:r>
+        <w:rPr>
+          <w:rFonts w:eastAsia="Arial Unicode MS"/>
+          <w:color w:val="212121"/>
+        </w:rPr>
+        <w:t>.”</w:t>
+      </w:r>
+      <w:r>
+        <w:rPr>
+          <w:color w:val="212121"/>
+        </w:rPr>
+        <w:t xml:space="preserve"> on line </w:t>
+      </w:r>
+      <w:r>
+        <w:rPr>
+          <w:color w:val="212121"/>
+        </w:rPr>
+        <w:t>107-110</w:t>
+      </w:r>
+      <w:r>
+        <w:rPr>
+          <w:color w:val="212121"/>
+        </w:rPr>
+        <w:t xml:space="preserve"> and distinguish this from recovery.</w:t>
+      </w:r>
+    </w:p>
+    <w:p>
+      <w:pPr>
+        <w:spacing w:line="240" w:lineRule="auto"/>
+        <w:rPr>
+          <w:color w:val="212121"/>
+        </w:rPr>
+      </w:pPr>
     </w:p>
     <w:p>
       <w:pPr>
@@ -227,51 +433,112 @@
         <w:ind w:left="1350"/>
         <w:rPr>
           <w:color w:val="212121"/>
-          <w:highlight w:val="yellow"/>
-        </w:rPr>
-      </w:pPr>
-      <w:r>
-        <w:rPr>
-          <w:color w:val="212121"/>
-        </w:rPr>
-        <w:t>We have included reference to a paper where we quantified seed capture with these carpets  “</w:t>
-      </w:r>
-      <w:r>
-        <w:rPr>
-          <w:rFonts w:ascii="Arial Unicode MS" w:eastAsia="Arial Unicode MS" w:hAnsi="Arial Unicode MS" w:cs="Arial Unicode MS"/>
-          <w:color w:val="212121"/>
-        </w:rPr>
-        <w:t xml:space="preserve">For example, recently Wynne et al. 2024 used artificial grass carpets for capturing seed rain in a successional </w:t>
-      </w:r>
-      <w:proofErr w:type="spellStart"/>
-      <w:r>
-        <w:rPr>
-          <w:rFonts w:ascii="Arial Unicode MS" w:eastAsia="Arial Unicode MS" w:hAnsi="Arial Unicode MS" w:cs="Arial Unicode MS"/>
-          <w:color w:val="212121"/>
-        </w:rPr>
-        <w:t>chronosequence</w:t>
-      </w:r>
-      <w:proofErr w:type="spellEnd"/>
-      <w:r>
-        <w:rPr>
-          <w:rFonts w:ascii="Arial Unicode MS" w:eastAsia="Arial Unicode MS" w:hAnsi="Arial Unicode MS" w:cs="Arial Unicode MS"/>
-          <w:color w:val="212121"/>
-        </w:rPr>
-        <w:t xml:space="preserve"> of temperate tallgrass prairies and were able to identify ∼27,000-124,000 seeds per square meter depending on the age of the grassland.”</w:t>
-      </w:r>
-      <w:r>
-        <w:rPr>
-          <w:color w:val="212121"/>
-          <w:highlight w:val="yellow"/>
-        </w:rPr>
-        <w:t xml:space="preserve"> on line 106-109 </w:t>
-      </w:r>
-      <w:r>
-        <w:rPr>
-          <w:color w:val="212121"/>
-        </w:rPr>
-        <w:t>and distinguish this from recovery.</w:t>
-      </w:r>
+        </w:rPr>
+      </w:pPr>
+      <w:r>
+        <w:rPr>
+          <w:color w:val="212121"/>
+        </w:rPr>
+        <w:lastRenderedPageBreak/>
+        <w:t>We have now defined the importance of a recovery study for determining trap efficacy.  On lines 11</w:t>
+      </w:r>
+      <w:r>
+        <w:rPr>
+          <w:color w:val="212121"/>
+        </w:rPr>
+        <w:t>6</w:t>
+      </w:r>
+      <w:r>
+        <w:rPr>
+          <w:color w:val="212121"/>
+        </w:rPr>
+        <w:t>-12</w:t>
+      </w:r>
+      <w:r>
+        <w:rPr>
+          <w:color w:val="212121"/>
+        </w:rPr>
+        <w:t>1</w:t>
+      </w:r>
+      <w:r>
+        <w:rPr>
+          <w:color w:val="212121"/>
+        </w:rPr>
+        <w:t xml:space="preserve">, we say “While our </w:t>
+      </w:r>
+      <w:proofErr w:type="gramStart"/>
+      <w:r>
+        <w:rPr>
+          <w:color w:val="212121"/>
+        </w:rPr>
+        <w:t>ultimate goal</w:t>
+      </w:r>
+      <w:proofErr w:type="gramEnd"/>
+      <w:r>
+        <w:rPr>
+          <w:color w:val="212121"/>
+        </w:rPr>
+        <w:t xml:space="preserve"> is to use these traps to capture seed rain in the wild, we first need to quantify how well each trap type retains known numbers of seeds under field-conditions.  Thus, we conduct “</w:t>
+      </w:r>
+      <w:r>
+        <w:rPr>
+          <w:color w:val="212121"/>
+        </w:rPr>
+        <w:t xml:space="preserve">seed </w:t>
+      </w:r>
+      <w:r>
+        <w:rPr>
+          <w:color w:val="212121"/>
+        </w:rPr>
+        <w:t xml:space="preserve">recovery” experiments where we put known numbers of seeds on each trap type and see how well we </w:t>
+      </w:r>
+      <w:proofErr w:type="gramStart"/>
+      <w:r>
+        <w:rPr>
+          <w:color w:val="212121"/>
+        </w:rPr>
+        <w:t>are able to</w:t>
+      </w:r>
+      <w:proofErr w:type="gramEnd"/>
+      <w:r>
+        <w:rPr>
+          <w:color w:val="212121"/>
+        </w:rPr>
+        <w:t xml:space="preserve"> recover these same seeds at distinct time intervals. This recovery measure provides information on how confident we can feel in whether we are measuring </w:t>
+      </w:r>
+      <w:r>
+        <w:rPr>
+          <w:i/>
+          <w:color w:val="212121"/>
+        </w:rPr>
+        <w:t>primary</w:t>
+      </w:r>
+      <w:r>
+        <w:rPr>
+          <w:color w:val="212121"/>
+        </w:rPr>
+        <w:t xml:space="preserve"> or </w:t>
+      </w:r>
+      <w:r>
+        <w:rPr>
+          <w:i/>
+          <w:color w:val="212121"/>
+        </w:rPr>
+        <w:t>effective</w:t>
+      </w:r>
+      <w:r>
+        <w:rPr>
+          <w:color w:val="212121"/>
+        </w:rPr>
+        <w:t xml:space="preserve"> seed dispersal.”</w:t>
+      </w:r>
+    </w:p>
+    <w:p>
+      <w:pPr>
+        <w:rPr>
+          <w:color w:val="212121"/>
+        </w:rPr>
+      </w:pPr>
     </w:p>
     <w:p>
       <w:pPr>
@@ -282,100 +549,51 @@
         <w:ind w:left="1350"/>
         <w:rPr>
           <w:color w:val="212121"/>
-          <w:highlight w:val="yellow"/>
-        </w:rPr>
-      </w:pPr>
-      <w:r>
-        <w:rPr>
-          <w:color w:val="212121"/>
-        </w:rPr>
-        <w:lastRenderedPageBreak/>
-        <w:t>We have now defined the importance of a recovery study for determining trap efficacy.</w:t>
-      </w:r>
-      <w:r>
-        <w:rPr>
-          <w:color w:val="212121"/>
-          <w:highlight w:val="yellow"/>
-        </w:rPr>
-        <w:t xml:space="preserve">  On lines 115-120, </w:t>
-      </w:r>
-      <w:r>
-        <w:rPr>
-          <w:color w:val="212121"/>
-        </w:rPr>
-        <w:t xml:space="preserve">we say “While our </w:t>
+        </w:rPr>
+      </w:pPr>
+      <w:r>
+        <w:rPr>
+          <w:color w:val="212121"/>
+        </w:rPr>
+        <w:t xml:space="preserve">In the discussion broadly, we now discuss how sticky traps are more likely to measure primary dispersal because less seeds are lost through time, and artificial turf tarps are more likely to measure effective dispersal </w:t>
+      </w:r>
+      <w:r>
+        <w:rPr>
+          <w:color w:val="212121"/>
+        </w:rPr>
+        <w:t xml:space="preserve">as </w:t>
+      </w:r>
+      <w:r>
+        <w:rPr>
+          <w:color w:val="212121"/>
+        </w:rPr>
+        <w:t xml:space="preserve">they retain </w:t>
       </w:r>
       <w:proofErr w:type="gramStart"/>
       <w:r>
         <w:rPr>
           <w:color w:val="212121"/>
         </w:rPr>
-        <w:t>ultimate goal</w:t>
+        <w:t>seeds, but</w:t>
       </w:r>
       <w:proofErr w:type="gramEnd"/>
       <w:r>
         <w:rPr>
           <w:color w:val="212121"/>
         </w:rPr>
-        <w:t xml:space="preserve"> is to use these traps to capture seed rain in the wild, we first need to quantify how well each trap type retains known numbers of seeds under field-conditions.  Thus, we conduct “recovery” experiments where we put known numbers of seeds on each trap type and see how well we </w:t>
-      </w:r>
-      <w:proofErr w:type="gramStart"/>
-      <w:r>
-        <w:rPr>
-          <w:color w:val="212121"/>
-        </w:rPr>
-        <w:t>are able to</w:t>
-      </w:r>
-      <w:proofErr w:type="gramEnd"/>
-      <w:r>
-        <w:rPr>
-          <w:color w:val="212121"/>
-        </w:rPr>
-        <w:t xml:space="preserve"> recover these same seeds at distinct time intervals. This recovery measure provides information on how confident we can feel in whether we are measuring </w:t>
-      </w:r>
-      <w:r>
-        <w:rPr>
-          <w:i/>
-          <w:color w:val="212121"/>
-        </w:rPr>
-        <w:t>primary</w:t>
-      </w:r>
-      <w:r>
-        <w:rPr>
-          <w:color w:val="212121"/>
-        </w:rPr>
-        <w:t xml:space="preserve"> or </w:t>
-      </w:r>
-      <w:r>
-        <w:rPr>
-          <w:i/>
-          <w:color w:val="212121"/>
-        </w:rPr>
-        <w:t>effective</w:t>
-      </w:r>
-      <w:r>
-        <w:rPr>
-          <w:color w:val="212121"/>
-        </w:rPr>
-        <w:t xml:space="preserve"> seed dispersal.”</w:t>
-      </w:r>
-    </w:p>
-    <w:p>
-      <w:pPr>
-        <w:numPr>
-          <w:ilvl w:val="0"/>
-          <w:numId w:val="1"/>
-        </w:numPr>
-        <w:ind w:left="1350"/>
-        <w:rPr>
-          <w:color w:val="212121"/>
-        </w:rPr>
-      </w:pPr>
-      <w:r>
-        <w:rPr>
-          <w:color w:val="212121"/>
-        </w:rPr>
-        <w:t xml:space="preserve">In the discussion broadly, we now discuss how sticky traps are more likely to measure primary dispersal because less seeds are lost through time, and artificial turf tarps are more likely to measure effective dispersal because they retain many seeds, but some are lost to </w:t>
+        <w:t xml:space="preserve"> </w:t>
+      </w:r>
+      <w:r>
+        <w:rPr>
+          <w:color w:val="212121"/>
+        </w:rPr>
+        <w:t xml:space="preserve">allow for ecologically realistic loss </w:t>
+      </w:r>
+      <w:r>
+        <w:rPr>
+          <w:color w:val="212121"/>
+        </w:rPr>
+        <w:t xml:space="preserve">to </w:t>
       </w:r>
       <w:proofErr w:type="spellStart"/>
       <w:r>
@@ -609,8 +827,21 @@
           <w:color w:val="212121"/>
         </w:rPr>
         <w:lastRenderedPageBreak/>
-        <w:t>While you are revising the manuscript according to the reviewer comments, please also take a moment to complete the following editorial changes:</w:t>
-      </w:r>
+        <w:t xml:space="preserve">While you are </w:t>
+      </w:r>
+      <w:r>
+        <w:rPr>
+          <w:color w:val="212121"/>
+        </w:rPr>
+        <w:t>revising the manuscript according to the reviewer comments, please also take a moment to complete the following editorial changes:</w:t>
+      </w:r>
+    </w:p>
+    <w:p>
+      <w:pPr>
+        <w:rPr>
+          <w:color w:val="212121"/>
+        </w:rPr>
+      </w:pPr>
     </w:p>
     <w:p>
       <w:pPr>
@@ -1032,7 +1263,63 @@
         <w:rPr>
           <w:color w:val="212121"/>
         </w:rPr>
-        <w:t xml:space="preserve"> We now do this!  Please see Main Point 1.  But we do now mention in the methods that the added species were not found in any of the vegetative communities of the site, so ambient arrival was impossible.  This is an important point to add.</w:t>
+        <w:t xml:space="preserve"> </w:t>
+      </w:r>
+      <w:r>
+        <w:rPr>
+          <w:color w:val="212121"/>
+        </w:rPr>
+        <w:t xml:space="preserve">Thank you for this suggestion, which we have incorporated. </w:t>
+      </w:r>
+      <w:r>
+        <w:rPr>
+          <w:color w:val="212121"/>
+        </w:rPr>
+        <w:t xml:space="preserve">Please see Main Point 1.  </w:t>
+      </w:r>
+      <w:r>
+        <w:rPr>
+          <w:color w:val="212121"/>
+        </w:rPr>
+        <w:t>Additionally, we</w:t>
+      </w:r>
+      <w:r>
+        <w:rPr>
+          <w:color w:val="212121"/>
+        </w:rPr>
+        <w:t xml:space="preserve"> now mention in the methods that the added species were</w:t>
+      </w:r>
+      <w:r>
+        <w:rPr>
+          <w:color w:val="212121"/>
+        </w:rPr>
+        <w:t xml:space="preserve"> </w:t>
+      </w:r>
+      <w:r>
+        <w:rPr>
+          <w:color w:val="212121"/>
+        </w:rPr>
+        <w:t xml:space="preserve">not found in any of the vegetative communities of the site, so ambient arrival was impossible.  This </w:t>
+      </w:r>
+      <w:r>
+        <w:rPr>
+          <w:color w:val="212121"/>
+        </w:rPr>
+        <w:t xml:space="preserve">allows us to ensure that all seeds were from recovery of those added rather than capture of seeds that might have </w:t>
+      </w:r>
+      <w:proofErr w:type="spellStart"/>
+      <w:r>
+        <w:rPr>
+          <w:color w:val="212121"/>
+        </w:rPr>
+        <w:t>dispered</w:t>
+      </w:r>
+      <w:proofErr w:type="spellEnd"/>
+      <w:r>
+        <w:rPr>
+          <w:color w:val="212121"/>
+        </w:rPr>
+        <w:t xml:space="preserve"> from the nearby community.</w:t>
       </w:r>
     </w:p>
     <w:p>
@@ -1134,7 +1421,76 @@
         <w:rPr>
           <w:color w:val="212121"/>
         </w:rPr>
-        <w:t xml:space="preserve"> so this information is valuable for readers.  We are happy to add a figure and discussion on this point!</w:t>
+        <w:t xml:space="preserve"> so this information is valuable for readers.</w:t>
+      </w:r>
+      <w:r>
+        <w:rPr>
+          <w:color w:val="212121"/>
+        </w:rPr>
+        <w:t xml:space="preserve"> We have now added a new figure to the manuscript (new Figure 2) and discuss the results on lines 210-213 “</w:t>
+      </w:r>
+      <w:r>
+        <w:t xml:space="preserve">Absolute and relative seed recovery varied by species and time (Figs. 2,3). There was high variability among absolute recovery by species, with some species having higher recovery broadly (e.g. </w:t>
+      </w:r>
+      <w:r>
+        <w:rPr>
+          <w:i/>
+          <w:iCs/>
+        </w:rPr>
+        <w:t xml:space="preserve">S. </w:t>
+      </w:r>
+      <w:proofErr w:type="spellStart"/>
+      <w:r>
+        <w:rPr>
+          <w:i/>
+          <w:iCs/>
+        </w:rPr>
+        <w:t>scoparium</w:t>
+      </w:r>
+      <w:proofErr w:type="spellEnd"/>
+      <w:r>
+        <w:t xml:space="preserve">, </w:t>
+      </w:r>
+      <w:r>
+        <w:rPr>
+          <w:i/>
+          <w:iCs/>
+        </w:rPr>
+        <w:t xml:space="preserve">B. </w:t>
+      </w:r>
+      <w:proofErr w:type="spellStart"/>
+      <w:r>
+        <w:rPr>
+          <w:i/>
+          <w:iCs/>
+        </w:rPr>
+        <w:t>dactyloides</w:t>
+      </w:r>
+      <w:proofErr w:type="spellEnd"/>
+      <w:r>
+        <w:t xml:space="preserve">), others had low recovery across all trap types (e.g. </w:t>
+      </w:r>
+      <w:r>
+        <w:rPr>
+          <w:i/>
+          <w:iCs/>
+        </w:rPr>
+        <w:t>H. annuus</w:t>
+      </w:r>
+      <w:r>
+        <w:t>), but most falling somewhere in the middle.</w:t>
+      </w:r>
+      <w:r>
+        <w:rPr>
+          <w:color w:val="212121"/>
+        </w:rPr>
+        <w:t>”.</w:t>
+      </w:r>
+      <w:r>
+        <w:rPr>
+          <w:color w:val="212121"/>
+        </w:rPr>
+        <w:t xml:space="preserve">  </w:t>
       </w:r>
     </w:p>
     <w:p>
@@ -1263,20 +1619,26 @@
         <w:rPr>
           <w:color w:val="212121"/>
         </w:rPr>
-        <w:t>In the same way we don’t want to promote one trap over another, we also don’t want to dictate how often traps should be replaced given the many issues experimentalists face with deciding when and how often they can go to the field.  Therefore, we suggest researchers use these traps when seeds are dispersing and replace them at a rate that they feel comfortable with based on the results.  So that likely means people will have to replace them multiple times throughout the season.</w:t>
-      </w:r>
-      <w:r>
-        <w:rPr>
-          <w:color w:val="212121"/>
-          <w:shd w:val="clear" w:color="auto" w:fill="FFD966"/>
-        </w:rPr>
-        <w:t xml:space="preserve">  On line 336-338 </w:t>
-      </w:r>
-      <w:r>
-        <w:rPr>
-          <w:color w:val="212121"/>
-        </w:rPr>
-        <w:t>we now say “Deciding how often to replace seed rain traps can often be dictated by person-power and ability to get to field sites.  Therefore, we suggest replacing traps at a rate that is feasible and interpreting results with caution given seeds are lost through time on all trap types.”</w:t>
+        <w:t>In the same way we don’t want to promote one trap over another, we also don’t want to dictate how often traps should be replaced given the m</w:t>
+      </w:r>
+      <w:r>
+        <w:rPr>
+          <w:color w:val="212121"/>
+        </w:rPr>
+        <w:t xml:space="preserve">any issues experimentalists face with deciding when and how often they can go to the field. </w:t>
+      </w:r>
+      <w:r>
+        <w:rPr>
+          <w:color w:val="212121"/>
+        </w:rPr>
+        <w:t xml:space="preserve">On line 340-342 we now say </w:t>
+      </w:r>
+      <w:r>
+        <w:rPr>
+          <w:color w:val="212121"/>
+        </w:rPr>
+        <w:lastRenderedPageBreak/>
+        <w:t>“Deciding how often to replace seed rain traps can often be dictated by person-power and ability to get to field sites.  Therefore, we suggest replacing traps at a rate that is feasible and interpreting results with caution given seeds are lost through time on all trap types.”</w:t>
       </w:r>
     </w:p>
     <w:p>
@@ -1412,7 +1774,13 @@
         <w:rPr>
           <w:color w:val="212121"/>
         </w:rPr>
-        <w:t xml:space="preserve"> Changes have been made.  There is a lot of white space, but it hopefully makes the point to readers.</w:t>
+        <w:t xml:space="preserve"> </w:t>
+      </w:r>
+      <w:r>
+        <w:rPr>
+          <w:color w:val="212121"/>
+        </w:rPr>
+        <w:t>We have altered the figure as suggested.</w:t>
       </w:r>
     </w:p>
     <w:p>
@@ -1501,6 +1869,35 @@
     <w:p>
       <w:pPr>
         <w:rPr>
+          <w:bCs/>
+          <w:color w:val="212121"/>
+        </w:rPr>
+      </w:pPr>
+      <w:r>
+        <w:rPr>
+          <w:b/>
+          <w:color w:val="212121"/>
+        </w:rPr>
+        <w:t>Response:</w:t>
+      </w:r>
+      <w:r>
+        <w:rPr>
+          <w:bCs/>
+          <w:color w:val="212121"/>
+        </w:rPr>
+        <w:t xml:space="preserve"> We thank the reviewer for their suggestions, which we have implemented as described below. </w:t>
+      </w:r>
+    </w:p>
+    <w:p>
+      <w:pPr>
+        <w:rPr>
+          <w:color w:val="212121"/>
+        </w:rPr>
+      </w:pPr>
+    </w:p>
+    <w:p>
+      <w:pPr>
+        <w:rPr>
           <w:color w:val="212121"/>
         </w:rPr>
       </w:pPr>
@@ -1515,7 +1912,14 @@
         <w:rPr>
           <w:color w:val="212121"/>
         </w:rPr>
-        <w:t xml:space="preserve"> 1) Seed rain capture vs retention: I am having a bit of trouble in seeing whether your methods allow assessing seed capture or seed retention in the traps (or both?). You use these terms sometimes interchangeably in the text (e.g. seed rain capture methods are mentioned in the end of the introduction in L100, but seed retention is specifically mentioned in the description of the aims of the study in L91 and in the methods in L116), and then some of the results </w:t>
+        <w:t xml:space="preserve"> 1) Seed rain capture vs retention: I am having a bit of trouble in seeing whether your methods allow assessing seed capture or seed retention in the traps (or both?). You use these terms sometimes interchangeably in the text (e.g. seed rain capture methods are mentioned in the end of the introduction in L100, but seed retention is specifically mentioned in the </w:t>
+      </w:r>
+      <w:r>
+        <w:rPr>
+          <w:color w:val="212121"/>
+        </w:rPr>
+        <w:lastRenderedPageBreak/>
+        <w:t xml:space="preserve">description of the aims of the study in L91 and in the methods in L116), and then some of the results </w:t>
       </w:r>
       <w:proofErr w:type="gramStart"/>
       <w:r>
@@ -1550,7 +1954,6 @@
           <w:b/>
           <w:color w:val="212121"/>
         </w:rPr>
-        <w:lastRenderedPageBreak/>
         <w:t>Response:</w:t>
       </w:r>
       <w:r>
@@ -1559,33 +1962,23 @@
         </w:rPr>
         <w:t xml:space="preserve"> We have </w:t>
       </w:r>
-      <w:proofErr w:type="gramStart"/>
-      <w:r>
-        <w:rPr>
-          <w:color w:val="212121"/>
-        </w:rPr>
-        <w:t>no</w:t>
-      </w:r>
-      <w:proofErr w:type="gramEnd"/>
-      <w:r>
-        <w:rPr>
-          <w:color w:val="212121"/>
-        </w:rPr>
-        <w:t xml:space="preserve"> made this point </w:t>
-      </w:r>
-      <w:proofErr w:type="gramStart"/>
-      <w:r>
-        <w:rPr>
-          <w:color w:val="212121"/>
-        </w:rPr>
-        <w:t>more clear</w:t>
-      </w:r>
-      <w:proofErr w:type="gramEnd"/>
-      <w:r>
-        <w:rPr>
-          <w:color w:val="212121"/>
-        </w:rPr>
-        <w:t>, see Main Point 1 for more details</w:t>
+      <w:r>
+        <w:rPr>
+          <w:color w:val="212121"/>
+        </w:rPr>
+        <w:t>clarified this point; please</w:t>
+      </w:r>
+      <w:r>
+        <w:rPr>
+          <w:color w:val="212121"/>
+        </w:rPr>
+        <w:t xml:space="preserve"> see Main Point 1 for more details</w:t>
+      </w:r>
+      <w:r>
+        <w:rPr>
+          <w:color w:val="212121"/>
+        </w:rPr>
+        <w:t>.</w:t>
       </w:r>
     </w:p>
     <w:p>
@@ -1714,7 +2107,19 @@
         <w:rPr>
           <w:color w:val="212121"/>
         </w:rPr>
-        <w:t>We have now fixed this line (see main point 2 for more info)</w:t>
+        <w:t xml:space="preserve">We have </w:t>
+      </w:r>
+      <w:r>
+        <w:rPr>
+          <w:color w:val="212121"/>
+        </w:rPr>
+        <w:t>altered this line so that we do not advocate for one method over another</w:t>
+      </w:r>
+      <w:r>
+        <w:rPr>
+          <w:color w:val="212121"/>
+        </w:rPr>
+        <w:t xml:space="preserve"> (see main point 2 for more info)</w:t>
       </w:r>
     </w:p>
     <w:p>
@@ -1749,883 +2154,6 @@
           <w:color w:val="212121"/>
         </w:rPr>
         <w:t xml:space="preserve"> L7-8: is the mention of Arctic systems necessary here? For me it opened more questions - was the use of artificial grass successful in Arctic systems? Was the comparison between sticky traps and artificial grass conducted there too? Has artificial grass not been used in systems other than Arctic? You answer many of these questions in the main text, so I see why you had this sentence here, but I found it a little bit confusing in the abstract.</w:t>
-      </w:r>
-    </w:p>
-    <w:p>
-      <w:pPr>
-        <w:rPr>
-          <w:color w:val="212121"/>
-        </w:rPr>
-      </w:pPr>
-    </w:p>
-    <w:p>
-      <w:pPr>
-        <w:rPr>
-          <w:color w:val="212121"/>
-        </w:rPr>
-      </w:pPr>
-      <w:r>
-        <w:rPr>
-          <w:b/>
-          <w:color w:val="212121"/>
-        </w:rPr>
-        <w:t xml:space="preserve">Response: </w:t>
-      </w:r>
-      <w:r>
-        <w:rPr>
-          <w:color w:val="212121"/>
-        </w:rPr>
-        <w:t xml:space="preserve">Thank you for this point.  We have now removed this mention from the abstract.  We just didn’t want readers to think we were the first to think of this idea, but if it’s </w:t>
-      </w:r>
-      <w:proofErr w:type="gramStart"/>
-      <w:r>
-        <w:rPr>
-          <w:color w:val="212121"/>
-        </w:rPr>
-        <w:t>confusing</w:t>
-      </w:r>
-      <w:proofErr w:type="gramEnd"/>
-      <w:r>
-        <w:rPr>
-          <w:color w:val="212121"/>
-        </w:rPr>
-        <w:t xml:space="preserve"> we’ll just remove it from the abstract.</w:t>
-      </w:r>
-    </w:p>
-    <w:p>
-      <w:pPr>
-        <w:rPr>
-          <w:color w:val="212121"/>
-        </w:rPr>
-      </w:pPr>
-    </w:p>
-    <w:p>
-      <w:pPr>
-        <w:rPr>
-          <w:color w:val="212121"/>
-        </w:rPr>
-      </w:pPr>
-      <w:r>
-        <w:rPr>
-          <w:b/>
-          <w:color w:val="212121"/>
-        </w:rPr>
-        <w:t>Comment:</w:t>
-      </w:r>
-      <w:r>
-        <w:rPr>
-          <w:color w:val="212121"/>
-        </w:rPr>
-        <w:t xml:space="preserve"> L18: the ending of the sentence seems too broad- you explain this better in the main text, but it feels a bit </w:t>
-      </w:r>
-      <w:proofErr w:type="spellStart"/>
-      <w:r>
-        <w:rPr>
-          <w:color w:val="212121"/>
-        </w:rPr>
-        <w:t>our</w:t>
-      </w:r>
-      <w:proofErr w:type="spellEnd"/>
-      <w:r>
-        <w:rPr>
-          <w:color w:val="212121"/>
-        </w:rPr>
-        <w:t xml:space="preserve"> of context here </w:t>
-      </w:r>
-    </w:p>
-    <w:p>
-      <w:pPr>
-        <w:rPr>
-          <w:color w:val="212121"/>
-        </w:rPr>
-      </w:pPr>
-    </w:p>
-    <w:p>
-      <w:pPr>
-        <w:rPr>
-          <w:color w:val="212121"/>
-        </w:rPr>
-      </w:pPr>
-      <w:r>
-        <w:rPr>
-          <w:b/>
-          <w:color w:val="212121"/>
-        </w:rPr>
-        <w:t>Response:</w:t>
-      </w:r>
-      <w:r>
-        <w:rPr>
-          <w:color w:val="212121"/>
-        </w:rPr>
-        <w:t xml:space="preserve"> We updated this to now read: “We encourage the broad adoption of seed rain studies to increase links between theoretical and empirical community ecology. Both sticky traps </w:t>
-      </w:r>
-      <w:r>
-        <w:rPr>
-          <w:color w:val="212121"/>
-        </w:rPr>
-        <w:lastRenderedPageBreak/>
-        <w:t xml:space="preserve">and artificial grass traps provide ways to measure seed rain in </w:t>
-      </w:r>
-      <w:proofErr w:type="gramStart"/>
-      <w:r>
-        <w:rPr>
-          <w:color w:val="212121"/>
-        </w:rPr>
-        <w:t>grasslands, but</w:t>
-      </w:r>
-      <w:proofErr w:type="gramEnd"/>
-      <w:r>
-        <w:rPr>
-          <w:color w:val="212121"/>
-        </w:rPr>
-        <w:t xml:space="preserve"> vary in the kinds of information they provide.” This was also requested by Reviewer 1</w:t>
-      </w:r>
-    </w:p>
-    <w:p>
-      <w:pPr>
-        <w:rPr>
-          <w:color w:val="212121"/>
-        </w:rPr>
-      </w:pPr>
-    </w:p>
-    <w:p>
-      <w:pPr>
-        <w:rPr>
-          <w:color w:val="212121"/>
-        </w:rPr>
-      </w:pPr>
-    </w:p>
-    <w:p>
-      <w:pPr>
-        <w:rPr>
-          <w:color w:val="212121"/>
-        </w:rPr>
-      </w:pPr>
-      <w:r>
-        <w:rPr>
-          <w:b/>
-          <w:color w:val="212121"/>
-        </w:rPr>
-        <w:t>Comment:</w:t>
-      </w:r>
-      <w:r>
-        <w:rPr>
-          <w:color w:val="212121"/>
-        </w:rPr>
-        <w:t xml:space="preserve"> L22: should this be "plant communities"? vegetative seemed to contradict seed dispersal ;)</w:t>
-      </w:r>
-    </w:p>
-    <w:p>
-      <w:pPr>
-        <w:rPr>
-          <w:color w:val="212121"/>
-        </w:rPr>
-      </w:pPr>
-    </w:p>
-    <w:p>
-      <w:pPr>
-        <w:rPr>
-          <w:color w:val="212121"/>
-        </w:rPr>
-      </w:pPr>
-      <w:r>
-        <w:rPr>
-          <w:b/>
-          <w:color w:val="212121"/>
-        </w:rPr>
-        <w:t xml:space="preserve">Response: </w:t>
-      </w:r>
-      <w:r>
-        <w:rPr>
-          <w:color w:val="212121"/>
-        </w:rPr>
-        <w:t>Yes!  Thank you.  This is now changed.</w:t>
-      </w:r>
-    </w:p>
-    <w:p>
-      <w:pPr>
-        <w:rPr>
-          <w:color w:val="212121"/>
-        </w:rPr>
-      </w:pPr>
-    </w:p>
-    <w:p>
-      <w:pPr>
-        <w:rPr>
-          <w:color w:val="212121"/>
-        </w:rPr>
-      </w:pPr>
-    </w:p>
-    <w:p>
-      <w:pPr>
-        <w:rPr>
-          <w:color w:val="212121"/>
-        </w:rPr>
-      </w:pPr>
-      <w:r>
-        <w:rPr>
-          <w:b/>
-          <w:color w:val="212121"/>
-        </w:rPr>
-        <w:t xml:space="preserve">Comment: </w:t>
-      </w:r>
-      <w:r>
-        <w:rPr>
-          <w:color w:val="212121"/>
-        </w:rPr>
-        <w:t>L95: use "artificial grass traps" here for consistency?</w:t>
-      </w:r>
-    </w:p>
-    <w:p>
-      <w:pPr>
-        <w:rPr>
-          <w:color w:val="212121"/>
-        </w:rPr>
-      </w:pPr>
-    </w:p>
-    <w:p>
-      <w:pPr>
-        <w:rPr>
-          <w:color w:val="212121"/>
-        </w:rPr>
-      </w:pPr>
-      <w:r>
-        <w:rPr>
-          <w:b/>
-          <w:color w:val="212121"/>
-        </w:rPr>
-        <w:t xml:space="preserve">Response:  </w:t>
-      </w:r>
-      <w:r>
-        <w:rPr>
-          <w:color w:val="212121"/>
-        </w:rPr>
-        <w:t>perfect thanks for catching this.  We have changed this here and throughout.</w:t>
-      </w:r>
-    </w:p>
-    <w:p>
-      <w:pPr>
-        <w:rPr>
-          <w:color w:val="212121"/>
-        </w:rPr>
-      </w:pPr>
-    </w:p>
-    <w:p>
-      <w:pPr>
-        <w:rPr>
-          <w:color w:val="212121"/>
-        </w:rPr>
-      </w:pPr>
-    </w:p>
-    <w:p>
-      <w:pPr>
-        <w:rPr>
-          <w:color w:val="212121"/>
-        </w:rPr>
-      </w:pPr>
-      <w:r>
-        <w:rPr>
-          <w:b/>
-          <w:color w:val="212121"/>
-        </w:rPr>
-        <w:t>Comment:</w:t>
-      </w:r>
-      <w:r>
-        <w:rPr>
-          <w:color w:val="212121"/>
-        </w:rPr>
-        <w:t xml:space="preserve"> L126: how far apart were the sticky traps and the artificial grass traps? Were they spatially paired (i.e. closer to each other than to the other replicates in a plot)?</w:t>
-      </w:r>
-    </w:p>
-    <w:p>
-      <w:pPr>
-        <w:rPr>
-          <w:color w:val="212121"/>
-        </w:rPr>
-      </w:pPr>
-    </w:p>
-    <w:p>
-      <w:pPr>
-        <w:rPr>
-          <w:color w:val="212121"/>
-        </w:rPr>
-      </w:pPr>
-      <w:r>
-        <w:rPr>
-          <w:b/>
-          <w:color w:val="212121"/>
-        </w:rPr>
-        <w:t>Response:</w:t>
-      </w:r>
-      <w:r>
-        <w:rPr>
-          <w:color w:val="212121"/>
-        </w:rPr>
-        <w:t xml:space="preserve"> Yes, we have now added this for clarity.</w:t>
-      </w:r>
-    </w:p>
-    <w:p>
-      <w:pPr>
-        <w:rPr>
-          <w:color w:val="212121"/>
-        </w:rPr>
-      </w:pPr>
-    </w:p>
-    <w:p>
-      <w:pPr>
-        <w:rPr>
-          <w:color w:val="212121"/>
-        </w:rPr>
-      </w:pPr>
-    </w:p>
-    <w:p>
-      <w:pPr>
-        <w:rPr>
-          <w:color w:val="212121"/>
-        </w:rPr>
-      </w:pPr>
-      <w:r>
-        <w:rPr>
-          <w:b/>
-          <w:color w:val="212121"/>
-        </w:rPr>
-        <w:t xml:space="preserve">Comment: </w:t>
-      </w:r>
-      <w:r>
-        <w:rPr>
-          <w:color w:val="212121"/>
-        </w:rPr>
-        <w:t>L133: can you report the size of Yucca seeds here?</w:t>
-      </w:r>
-    </w:p>
-    <w:p>
-      <w:pPr>
-        <w:rPr>
-          <w:color w:val="212121"/>
-        </w:rPr>
-      </w:pPr>
-    </w:p>
-    <w:p>
-      <w:pPr>
-        <w:rPr>
-          <w:color w:val="212121"/>
-        </w:rPr>
-      </w:pPr>
-      <w:r>
-        <w:rPr>
-          <w:b/>
-          <w:color w:val="212121"/>
-        </w:rPr>
-        <w:t>Response:</w:t>
-      </w:r>
-      <w:r>
-        <w:rPr>
-          <w:color w:val="212121"/>
-        </w:rPr>
-        <w:t xml:space="preserve"> we have now included this.</w:t>
-      </w:r>
-    </w:p>
-    <w:p>
-      <w:pPr>
-        <w:rPr>
-          <w:color w:val="212121"/>
-        </w:rPr>
-      </w:pPr>
-    </w:p>
-    <w:p>
-      <w:pPr>
-        <w:rPr>
-          <w:color w:val="212121"/>
-        </w:rPr>
-      </w:pPr>
-    </w:p>
-    <w:p>
-      <w:pPr>
-        <w:rPr>
-          <w:color w:val="212121"/>
-        </w:rPr>
-      </w:pPr>
-      <w:r>
-        <w:rPr>
-          <w:b/>
-          <w:color w:val="212121"/>
-        </w:rPr>
-        <w:t>Comment:</w:t>
-      </w:r>
-      <w:r>
-        <w:rPr>
-          <w:color w:val="212121"/>
-        </w:rPr>
-        <w:t xml:space="preserve"> L137: I understand from this statement that you recorded only "recaptured" seeds - was there no natural seed rain?</w:t>
-      </w:r>
-    </w:p>
-    <w:p>
-      <w:pPr>
-        <w:rPr>
-          <w:color w:val="212121"/>
-        </w:rPr>
-      </w:pPr>
-    </w:p>
-    <w:p>
-      <w:pPr>
-        <w:rPr>
-          <w:color w:val="212121"/>
-        </w:rPr>
-      </w:pPr>
-      <w:r>
-        <w:rPr>
-          <w:b/>
-          <w:color w:val="212121"/>
-        </w:rPr>
-        <w:t xml:space="preserve">Response: </w:t>
-      </w:r>
-      <w:r>
-        <w:rPr>
-          <w:color w:val="212121"/>
-        </w:rPr>
-        <w:t>We had natural seed rain captured on the traps.  We have information on this but did not include it in the paper for simplicity.</w:t>
-      </w:r>
-    </w:p>
-    <w:p>
-      <w:pPr>
-        <w:rPr>
-          <w:color w:val="212121"/>
-        </w:rPr>
-      </w:pPr>
-    </w:p>
-    <w:p>
-      <w:pPr>
-        <w:rPr>
-          <w:color w:val="212121"/>
-        </w:rPr>
-      </w:pPr>
-    </w:p>
-    <w:p>
-      <w:pPr>
-        <w:rPr>
-          <w:color w:val="212121"/>
-        </w:rPr>
-      </w:pPr>
-      <w:r>
-        <w:rPr>
-          <w:b/>
-          <w:color w:val="212121"/>
-        </w:rPr>
-        <w:t xml:space="preserve">Comment: </w:t>
-      </w:r>
-      <w:r>
-        <w:rPr>
-          <w:color w:val="212121"/>
-        </w:rPr>
-        <w:t xml:space="preserve">L165: can you include site as a random factor if it only has two levels, or would this be better included as a fixed factor in the mixed effects model? </w:t>
-      </w:r>
-      <w:proofErr w:type="gramStart"/>
-      <w:r>
-        <w:rPr>
-          <w:color w:val="212121"/>
-        </w:rPr>
-        <w:t>Also</w:t>
-      </w:r>
-      <w:proofErr w:type="gramEnd"/>
-      <w:r>
-        <w:rPr>
-          <w:color w:val="212121"/>
-        </w:rPr>
-        <w:t xml:space="preserve"> because the two sites represent two different habitats (tallgrass vs shortgrass) it could be useful to have that as part of the main question as a fixed effect.</w:t>
-      </w:r>
-    </w:p>
-    <w:p>
-      <w:pPr>
-        <w:rPr>
-          <w:color w:val="212121"/>
-        </w:rPr>
-      </w:pPr>
-    </w:p>
-    <w:p>
-      <w:pPr>
-        <w:rPr>
-          <w:color w:val="212121"/>
-        </w:rPr>
-      </w:pPr>
-      <w:r>
-        <w:rPr>
-          <w:b/>
-          <w:color w:val="212121"/>
-        </w:rPr>
-        <w:t>Response:</w:t>
-      </w:r>
-      <w:r>
-        <w:rPr>
-          <w:color w:val="212121"/>
-        </w:rPr>
-        <w:t xml:space="preserve"> This is a stats philosophy question for sure, and you can run these models either way.  Because we only have two sites, we don’t feel comfortable making statements about these locations specifically and would prefer to talk about the patterns broadly - thus leaving them as random effects.  </w:t>
-      </w:r>
-      <w:proofErr w:type="gramStart"/>
-      <w:r>
-        <w:rPr>
-          <w:color w:val="212121"/>
-        </w:rPr>
-        <w:t>However</w:t>
-      </w:r>
-      <w:proofErr w:type="gramEnd"/>
-      <w:r>
-        <w:rPr>
-          <w:color w:val="212121"/>
-        </w:rPr>
-        <w:t xml:space="preserve"> I will note that we tried running these models with site as a fixed effect and there are different levels of recovery between the two sites.  This is accounted </w:t>
-      </w:r>
-      <w:r>
-        <w:rPr>
-          <w:color w:val="212121"/>
-        </w:rPr>
-        <w:lastRenderedPageBreak/>
-        <w:t>for with site-level random intercepts now, but we would love to know how these rates of recovery vary across a larger number of sites and site factors!</w:t>
-      </w:r>
-    </w:p>
-    <w:p>
-      <w:pPr>
-        <w:rPr>
-          <w:color w:val="212121"/>
-        </w:rPr>
-      </w:pPr>
-    </w:p>
-    <w:p>
-      <w:pPr>
-        <w:rPr>
-          <w:color w:val="212121"/>
-        </w:rPr>
-      </w:pPr>
-    </w:p>
-    <w:p>
-      <w:pPr>
-        <w:rPr>
-          <w:color w:val="212121"/>
-        </w:rPr>
-      </w:pPr>
-      <w:r>
-        <w:rPr>
-          <w:b/>
-          <w:color w:val="212121"/>
-        </w:rPr>
-        <w:t xml:space="preserve">Comment: </w:t>
-      </w:r>
-      <w:r>
-        <w:rPr>
-          <w:color w:val="212121"/>
-        </w:rPr>
-        <w:t>L199: were there differences in seed loss between trap types? Maybe you could indicate here the observations of seed fragments that could be related to seed predation?</w:t>
-      </w:r>
-    </w:p>
-    <w:p>
-      <w:pPr>
-        <w:rPr>
-          <w:color w:val="212121"/>
-        </w:rPr>
-      </w:pPr>
-    </w:p>
-    <w:p>
-      <w:pPr>
-        <w:rPr>
-          <w:color w:val="212121"/>
-        </w:rPr>
-      </w:pPr>
-      <w:r>
-        <w:rPr>
-          <w:b/>
-          <w:color w:val="212121"/>
-        </w:rPr>
-        <w:t>Response:</w:t>
-      </w:r>
-      <w:r>
-        <w:rPr>
-          <w:color w:val="212121"/>
-        </w:rPr>
-        <w:t xml:space="preserve"> there were not differences in seed loss per trap type per time.  We did add the reference to the seed fragments and possible predation.</w:t>
-      </w:r>
-    </w:p>
-    <w:p>
-      <w:pPr>
-        <w:rPr>
-          <w:color w:val="212121"/>
-        </w:rPr>
-      </w:pPr>
-    </w:p>
-    <w:p>
-      <w:pPr>
-        <w:rPr>
-          <w:color w:val="212121"/>
-        </w:rPr>
-      </w:pPr>
-    </w:p>
-    <w:p>
-      <w:pPr>
-        <w:rPr>
-          <w:color w:val="212121"/>
-        </w:rPr>
-      </w:pPr>
-      <w:r>
-        <w:rPr>
-          <w:b/>
-          <w:color w:val="212121"/>
-        </w:rPr>
-        <w:t xml:space="preserve">Comment: </w:t>
-      </w:r>
-      <w:r>
-        <w:rPr>
-          <w:color w:val="212121"/>
-        </w:rPr>
-        <w:t>L217-220: see my comments above - given some of the limitations of artificial grass traps you mention, I think you should (definitively!) provide the reasons, but let the readers decide by themselves ;)</w:t>
-      </w:r>
-    </w:p>
-    <w:p>
-      <w:pPr>
-        <w:rPr>
-          <w:color w:val="212121"/>
-        </w:rPr>
-      </w:pPr>
-    </w:p>
-    <w:p>
-      <w:pPr>
-        <w:rPr>
-          <w:color w:val="212121"/>
-        </w:rPr>
-      </w:pPr>
-      <w:r>
-        <w:rPr>
-          <w:b/>
-          <w:color w:val="212121"/>
-        </w:rPr>
-        <w:t>Response:</w:t>
-      </w:r>
-      <w:r>
-        <w:rPr>
-          <w:color w:val="212121"/>
-        </w:rPr>
-        <w:t xml:space="preserve"> We agree!  We have now made this change (see Main Point #2 for details)</w:t>
-      </w:r>
-    </w:p>
-    <w:p>
-      <w:pPr>
-        <w:rPr>
-          <w:color w:val="212121"/>
-        </w:rPr>
-      </w:pPr>
-    </w:p>
-    <w:p>
-      <w:pPr>
-        <w:rPr>
-          <w:color w:val="212121"/>
-        </w:rPr>
-      </w:pPr>
-    </w:p>
-    <w:p>
-      <w:pPr>
-        <w:rPr>
-          <w:color w:val="212121"/>
-        </w:rPr>
-      </w:pPr>
-      <w:r>
-        <w:rPr>
-          <w:b/>
-          <w:color w:val="212121"/>
-        </w:rPr>
-        <w:t xml:space="preserve">Comment: </w:t>
-      </w:r>
-      <w:r>
-        <w:rPr>
-          <w:color w:val="212121"/>
-        </w:rPr>
-        <w:t>L224: does this then mean that artificial grass traps had 48% seed loss?</w:t>
-      </w:r>
-    </w:p>
-    <w:p>
-      <w:pPr>
-        <w:rPr>
-          <w:color w:val="212121"/>
-        </w:rPr>
-      </w:pPr>
-    </w:p>
-    <w:p>
-      <w:pPr>
-        <w:rPr>
-          <w:color w:val="212121"/>
-        </w:rPr>
-      </w:pPr>
-      <w:r>
-        <w:rPr>
-          <w:b/>
-          <w:color w:val="212121"/>
-        </w:rPr>
-        <w:t xml:space="preserve">Response: </w:t>
-      </w:r>
-      <w:r>
-        <w:rPr>
-          <w:color w:val="212121"/>
-        </w:rPr>
-        <w:t>yes, on average</w:t>
-      </w:r>
-    </w:p>
-    <w:p>
-      <w:pPr>
-        <w:rPr>
-          <w:color w:val="212121"/>
-        </w:rPr>
-      </w:pPr>
-    </w:p>
-    <w:p>
-      <w:pPr>
-        <w:rPr>
-          <w:color w:val="212121"/>
-        </w:rPr>
-      </w:pPr>
-    </w:p>
-    <w:p>
-      <w:pPr>
-        <w:rPr>
-          <w:color w:val="212121"/>
-        </w:rPr>
-      </w:pPr>
-      <w:r>
-        <w:rPr>
-          <w:b/>
-          <w:color w:val="212121"/>
-        </w:rPr>
-        <w:t xml:space="preserve">Comment: </w:t>
-      </w:r>
-      <w:r>
-        <w:rPr>
-          <w:color w:val="212121"/>
-        </w:rPr>
-        <w:t>L236: but maybe some of those non-recovered seeds are just washed away from the traps but stay close by and still contribute to the aboveground community? (not sure if this question makes a lot of sense?)</w:t>
-      </w:r>
-    </w:p>
-    <w:p>
-      <w:pPr>
-        <w:rPr>
-          <w:color w:val="212121"/>
-        </w:rPr>
-      </w:pPr>
-    </w:p>
-    <w:p>
-      <w:pPr>
-        <w:rPr>
-          <w:color w:val="212121"/>
-        </w:rPr>
-      </w:pPr>
-      <w:r>
-        <w:rPr>
-          <w:b/>
-          <w:color w:val="212121"/>
-        </w:rPr>
-        <w:t xml:space="preserve">Response: </w:t>
-      </w:r>
-      <w:r>
-        <w:rPr>
-          <w:color w:val="212121"/>
-        </w:rPr>
-        <w:t xml:space="preserve"> Yes, they totally could have!  Just not in the specific location where the trap is.  And </w:t>
-      </w:r>
-      <w:proofErr w:type="gramStart"/>
-      <w:r>
-        <w:rPr>
-          <w:color w:val="212121"/>
-        </w:rPr>
-        <w:t>so</w:t>
-      </w:r>
-      <w:proofErr w:type="gramEnd"/>
-      <w:r>
-        <w:rPr>
-          <w:color w:val="212121"/>
-        </w:rPr>
-        <w:t xml:space="preserve"> if you pair traps with aboveground vegetation monitoring, then those seeds wouldn’t be contributing there.  We’ve updated the statement to reflect this.</w:t>
-      </w:r>
-    </w:p>
-    <w:p>
-      <w:pPr>
-        <w:rPr>
-          <w:color w:val="212121"/>
-        </w:rPr>
-      </w:pPr>
-    </w:p>
-    <w:p>
-      <w:pPr>
-        <w:rPr>
-          <w:color w:val="212121"/>
-        </w:rPr>
-      </w:pPr>
-    </w:p>
-    <w:p>
-      <w:pPr>
-        <w:rPr>
-          <w:color w:val="212121"/>
-        </w:rPr>
-      </w:pPr>
-      <w:r>
-        <w:rPr>
-          <w:b/>
-          <w:color w:val="212121"/>
-        </w:rPr>
-        <w:t>Comment:</w:t>
-      </w:r>
-      <w:r>
-        <w:rPr>
-          <w:color w:val="212121"/>
-        </w:rPr>
-        <w:t xml:space="preserve"> L237-239: not sure I follow the logic here. Why is this only for artificial grass traps?</w:t>
-      </w:r>
-    </w:p>
-    <w:p>
-      <w:pPr>
-        <w:rPr>
-          <w:color w:val="212121"/>
-        </w:rPr>
-      </w:pPr>
-    </w:p>
-    <w:p>
-      <w:pPr>
-        <w:rPr>
-          <w:color w:val="212121"/>
-        </w:rPr>
-      </w:pPr>
-      <w:r>
-        <w:rPr>
-          <w:b/>
-          <w:color w:val="212121"/>
-        </w:rPr>
-        <w:t>Response:</w:t>
-      </w:r>
-      <w:r>
-        <w:rPr>
-          <w:color w:val="212121"/>
-        </w:rPr>
-        <w:t xml:space="preserve"> It’s true that some seeds were lost for sticky traps, just a lot less.  So that’s more of a measure of primary dispersal on sticky traps because if you assume anything that could get lost to the environment, does in artificial grass traps (because they are open to the environment) and so that’s the lower limit of what you’d expect in the area, then the sticky traps are a LOT higher.  It’s true they are not a perfect measure of primary dispersal, but they are a lot closer than the astroturf carpets.</w:t>
-      </w:r>
-    </w:p>
-    <w:p>
-      <w:pPr>
-        <w:rPr>
-          <w:color w:val="212121"/>
-        </w:rPr>
-      </w:pPr>
-    </w:p>
-    <w:p>
-      <w:pPr>
-        <w:rPr>
-          <w:color w:val="212121"/>
-        </w:rPr>
-      </w:pPr>
-      <w:r>
-        <w:rPr>
-          <w:b/>
-          <w:color w:val="212121"/>
-        </w:rPr>
-        <w:t xml:space="preserve">Comment: </w:t>
-      </w:r>
-      <w:r>
-        <w:rPr>
-          <w:color w:val="212121"/>
-        </w:rPr>
-        <w:t>L269: did you find evidence of artificial grass traps continuing to collect and store seeds?</w:t>
       </w:r>
     </w:p>
     <w:p>
@@ -2653,6 +2181,951 @@
         <w:rPr>
           <w:color w:val="212121"/>
         </w:rPr>
+        <w:t>Thank you for this point.  We have now removed this mention from the abstract.  We just didn’t want readers to think we were the first to think of this idea</w:t>
+      </w:r>
+      <w:r>
+        <w:rPr>
+          <w:color w:val="212121"/>
+        </w:rPr>
+        <w:t>. Given the confusion, we</w:t>
+      </w:r>
+      <w:r>
+        <w:rPr>
+          <w:color w:val="212121"/>
+        </w:rPr>
+        <w:t xml:space="preserve"> remove</w:t>
+      </w:r>
+      <w:r>
+        <w:rPr>
+          <w:color w:val="212121"/>
+        </w:rPr>
+        <w:t>d</w:t>
+      </w:r>
+      <w:r>
+        <w:rPr>
+          <w:color w:val="212121"/>
+        </w:rPr>
+        <w:t xml:space="preserve"> it from the abstract</w:t>
+      </w:r>
+      <w:r>
+        <w:rPr>
+          <w:color w:val="212121"/>
+        </w:rPr>
+        <w:t xml:space="preserve"> and save this detail for the Introduction.</w:t>
+      </w:r>
+    </w:p>
+    <w:p>
+      <w:pPr>
+        <w:rPr>
+          <w:color w:val="212121"/>
+        </w:rPr>
+      </w:pPr>
+    </w:p>
+    <w:p>
+      <w:pPr>
+        <w:rPr>
+          <w:color w:val="212121"/>
+        </w:rPr>
+      </w:pPr>
+      <w:r>
+        <w:rPr>
+          <w:b/>
+          <w:color w:val="212121"/>
+        </w:rPr>
+        <w:t>Comment:</w:t>
+      </w:r>
+      <w:r>
+        <w:rPr>
+          <w:color w:val="212121"/>
+        </w:rPr>
+        <w:t xml:space="preserve"> L18: the ending of the sentence seems too broad- you explain this better in the main text, but it feels a bit </w:t>
+      </w:r>
+      <w:proofErr w:type="spellStart"/>
+      <w:r>
+        <w:rPr>
+          <w:color w:val="212121"/>
+        </w:rPr>
+        <w:t>our</w:t>
+      </w:r>
+      <w:proofErr w:type="spellEnd"/>
+      <w:r>
+        <w:rPr>
+          <w:color w:val="212121"/>
+        </w:rPr>
+        <w:t xml:space="preserve"> of context here </w:t>
+      </w:r>
+    </w:p>
+    <w:p>
+      <w:pPr>
+        <w:rPr>
+          <w:color w:val="212121"/>
+        </w:rPr>
+      </w:pPr>
+    </w:p>
+    <w:p>
+      <w:pPr>
+        <w:rPr>
+          <w:color w:val="212121"/>
+        </w:rPr>
+      </w:pPr>
+      <w:r>
+        <w:rPr>
+          <w:b/>
+          <w:color w:val="212121"/>
+        </w:rPr>
+        <w:t>Response:</w:t>
+      </w:r>
+      <w:r>
+        <w:rPr>
+          <w:color w:val="212121"/>
+        </w:rPr>
+        <w:t xml:space="preserve"> We updated this to now read: “We encourage the broad adoption of seed rain studies to increase links between theoretical and empirical community ecology. Both sticky traps and artificial grass traps provide ways to measure seed rain in </w:t>
+      </w:r>
+      <w:proofErr w:type="gramStart"/>
+      <w:r>
+        <w:rPr>
+          <w:color w:val="212121"/>
+        </w:rPr>
+        <w:t>grasslands, but</w:t>
+      </w:r>
+      <w:proofErr w:type="gramEnd"/>
+      <w:r>
+        <w:rPr>
+          <w:color w:val="212121"/>
+        </w:rPr>
+        <w:t xml:space="preserve"> vary in the kinds of information they provide.” This was also requested by Reviewer 1</w:t>
+      </w:r>
+    </w:p>
+    <w:p>
+      <w:pPr>
+        <w:rPr>
+          <w:color w:val="212121"/>
+        </w:rPr>
+      </w:pPr>
+    </w:p>
+    <w:p>
+      <w:pPr>
+        <w:rPr>
+          <w:color w:val="212121"/>
+        </w:rPr>
+      </w:pPr>
+    </w:p>
+    <w:p>
+      <w:pPr>
+        <w:rPr>
+          <w:color w:val="212121"/>
+        </w:rPr>
+      </w:pPr>
+      <w:r>
+        <w:rPr>
+          <w:b/>
+          <w:color w:val="212121"/>
+        </w:rPr>
+        <w:t>Comment:</w:t>
+      </w:r>
+      <w:r>
+        <w:rPr>
+          <w:color w:val="212121"/>
+        </w:rPr>
+        <w:t xml:space="preserve"> L22: should this be "plant communities"? vegetative seemed to contradict seed dispersal ;)</w:t>
+      </w:r>
+    </w:p>
+    <w:p>
+      <w:pPr>
+        <w:rPr>
+          <w:color w:val="212121"/>
+        </w:rPr>
+      </w:pPr>
+    </w:p>
+    <w:p>
+      <w:pPr>
+        <w:rPr>
+          <w:color w:val="212121"/>
+        </w:rPr>
+      </w:pPr>
+      <w:r>
+        <w:rPr>
+          <w:b/>
+          <w:color w:val="212121"/>
+        </w:rPr>
+        <w:t xml:space="preserve">Response: </w:t>
+      </w:r>
+      <w:r>
+        <w:rPr>
+          <w:color w:val="212121"/>
+        </w:rPr>
+        <w:t>Yes!  Thank you.  This is now changed.</w:t>
+      </w:r>
+    </w:p>
+    <w:p>
+      <w:pPr>
+        <w:rPr>
+          <w:color w:val="212121"/>
+        </w:rPr>
+      </w:pPr>
+    </w:p>
+    <w:p>
+      <w:pPr>
+        <w:rPr>
+          <w:color w:val="212121"/>
+        </w:rPr>
+      </w:pPr>
+    </w:p>
+    <w:p>
+      <w:pPr>
+        <w:rPr>
+          <w:color w:val="212121"/>
+        </w:rPr>
+      </w:pPr>
+      <w:r>
+        <w:rPr>
+          <w:b/>
+          <w:color w:val="212121"/>
+        </w:rPr>
+        <w:t xml:space="preserve">Comment: </w:t>
+      </w:r>
+      <w:r>
+        <w:rPr>
+          <w:color w:val="212121"/>
+        </w:rPr>
+        <w:t>L95: use "artificial grass traps" here for consistency?</w:t>
+      </w:r>
+    </w:p>
+    <w:p>
+      <w:pPr>
+        <w:rPr>
+          <w:color w:val="212121"/>
+        </w:rPr>
+      </w:pPr>
+    </w:p>
+    <w:p>
+      <w:pPr>
+        <w:rPr>
+          <w:color w:val="212121"/>
+        </w:rPr>
+      </w:pPr>
+      <w:r>
+        <w:rPr>
+          <w:b/>
+          <w:color w:val="212121"/>
+        </w:rPr>
+        <w:t xml:space="preserve">Response:  </w:t>
+      </w:r>
+      <w:r>
+        <w:rPr>
+          <w:color w:val="212121"/>
+        </w:rPr>
+        <w:t>perfect thanks for catching this.  We have changed this here and throughout.</w:t>
+      </w:r>
+    </w:p>
+    <w:p>
+      <w:pPr>
+        <w:rPr>
+          <w:color w:val="212121"/>
+        </w:rPr>
+      </w:pPr>
+    </w:p>
+    <w:p>
+      <w:pPr>
+        <w:rPr>
+          <w:color w:val="212121"/>
+        </w:rPr>
+      </w:pPr>
+    </w:p>
+    <w:p>
+      <w:pPr>
+        <w:rPr>
+          <w:color w:val="212121"/>
+        </w:rPr>
+      </w:pPr>
+      <w:r>
+        <w:rPr>
+          <w:b/>
+          <w:color w:val="212121"/>
+        </w:rPr>
+        <w:t>Comment:</w:t>
+      </w:r>
+      <w:r>
+        <w:rPr>
+          <w:color w:val="212121"/>
+        </w:rPr>
+        <w:t xml:space="preserve"> L126: how far apart were the sticky traps and the artificial grass traps? Were they spatially paired (i.e. closer to each other than to the other replicates in a plot)?</w:t>
+      </w:r>
+    </w:p>
+    <w:p>
+      <w:pPr>
+        <w:rPr>
+          <w:color w:val="212121"/>
+        </w:rPr>
+      </w:pPr>
+    </w:p>
+    <w:p>
+      <w:pPr>
+        <w:rPr>
+          <w:color w:val="212121"/>
+        </w:rPr>
+      </w:pPr>
+      <w:r>
+        <w:rPr>
+          <w:b/>
+          <w:color w:val="212121"/>
+        </w:rPr>
+        <w:t>Response:</w:t>
+      </w:r>
+      <w:r>
+        <w:rPr>
+          <w:color w:val="212121"/>
+        </w:rPr>
+        <w:t xml:space="preserve"> Yes, we have now added this for clarity.</w:t>
+      </w:r>
+    </w:p>
+    <w:p>
+      <w:pPr>
+        <w:rPr>
+          <w:color w:val="212121"/>
+        </w:rPr>
+      </w:pPr>
+    </w:p>
+    <w:p>
+      <w:pPr>
+        <w:rPr>
+          <w:color w:val="212121"/>
+        </w:rPr>
+      </w:pPr>
+    </w:p>
+    <w:p>
+      <w:pPr>
+        <w:rPr>
+          <w:color w:val="212121"/>
+        </w:rPr>
+      </w:pPr>
+      <w:r>
+        <w:rPr>
+          <w:b/>
+          <w:color w:val="212121"/>
+        </w:rPr>
+        <w:t xml:space="preserve">Comment: </w:t>
+      </w:r>
+      <w:r>
+        <w:rPr>
+          <w:color w:val="212121"/>
+        </w:rPr>
+        <w:t>L133: can you report the size of Yucca seeds here?</w:t>
+      </w:r>
+    </w:p>
+    <w:p>
+      <w:pPr>
+        <w:rPr>
+          <w:color w:val="212121"/>
+        </w:rPr>
+      </w:pPr>
+    </w:p>
+    <w:p>
+      <w:pPr>
+        <w:rPr>
+          <w:color w:val="212121"/>
+        </w:rPr>
+      </w:pPr>
+      <w:r>
+        <w:rPr>
+          <w:b/>
+          <w:color w:val="212121"/>
+        </w:rPr>
+        <w:t>Response:</w:t>
+      </w:r>
+      <w:r>
+        <w:rPr>
+          <w:color w:val="212121"/>
+        </w:rPr>
+        <w:t xml:space="preserve"> we have now included this.</w:t>
+      </w:r>
+    </w:p>
+    <w:p>
+      <w:pPr>
+        <w:rPr>
+          <w:color w:val="212121"/>
+        </w:rPr>
+      </w:pPr>
+    </w:p>
+    <w:p>
+      <w:pPr>
+        <w:rPr>
+          <w:color w:val="212121"/>
+        </w:rPr>
+      </w:pPr>
+    </w:p>
+    <w:p>
+      <w:pPr>
+        <w:rPr>
+          <w:color w:val="212121"/>
+        </w:rPr>
+      </w:pPr>
+      <w:r>
+        <w:rPr>
+          <w:b/>
+          <w:color w:val="212121"/>
+        </w:rPr>
+        <w:t>Comment:</w:t>
+      </w:r>
+      <w:r>
+        <w:rPr>
+          <w:color w:val="212121"/>
+        </w:rPr>
+        <w:t xml:space="preserve"> L137: I understand from this statement that you recorded only "recaptured" seeds - was there no natural seed rain?</w:t>
+      </w:r>
+    </w:p>
+    <w:p>
+      <w:pPr>
+        <w:rPr>
+          <w:color w:val="212121"/>
+        </w:rPr>
+      </w:pPr>
+    </w:p>
+    <w:p>
+      <w:pPr>
+        <w:rPr>
+          <w:color w:val="212121"/>
+        </w:rPr>
+      </w:pPr>
+      <w:r>
+        <w:rPr>
+          <w:b/>
+          <w:color w:val="212121"/>
+        </w:rPr>
+        <w:t xml:space="preserve">Response: </w:t>
+      </w:r>
+      <w:r>
+        <w:rPr>
+          <w:color w:val="212121"/>
+        </w:rPr>
+        <w:t xml:space="preserve">We </w:t>
+      </w:r>
+      <w:r>
+        <w:rPr>
+          <w:color w:val="212121"/>
+        </w:rPr>
+        <w:t xml:space="preserve">did have </w:t>
+      </w:r>
+      <w:r>
+        <w:rPr>
+          <w:color w:val="212121"/>
+        </w:rPr>
+        <w:t>natural seed rain on</w:t>
+      </w:r>
+      <w:r>
+        <w:rPr>
+          <w:color w:val="212121"/>
+        </w:rPr>
+        <w:t>to</w:t>
+      </w:r>
+      <w:r>
+        <w:rPr>
+          <w:color w:val="212121"/>
+        </w:rPr>
+        <w:t xml:space="preserve"> the traps.  We have information on this but did not include it in the paper for simplicity</w:t>
+      </w:r>
+      <w:r>
+        <w:rPr>
+          <w:color w:val="212121"/>
+        </w:rPr>
+        <w:t>, so that we can focus on recovery</w:t>
+      </w:r>
+      <w:r>
+        <w:rPr>
+          <w:color w:val="212121"/>
+        </w:rPr>
+        <w:t>.</w:t>
+      </w:r>
+    </w:p>
+    <w:p>
+      <w:pPr>
+        <w:rPr>
+          <w:color w:val="212121"/>
+        </w:rPr>
+      </w:pPr>
+    </w:p>
+    <w:p>
+      <w:pPr>
+        <w:rPr>
+          <w:color w:val="212121"/>
+        </w:rPr>
+      </w:pPr>
+    </w:p>
+    <w:p>
+      <w:pPr>
+        <w:rPr>
+          <w:color w:val="212121"/>
+        </w:rPr>
+      </w:pPr>
+      <w:r>
+        <w:rPr>
+          <w:b/>
+          <w:color w:val="212121"/>
+        </w:rPr>
+        <w:t xml:space="preserve">Comment: </w:t>
+      </w:r>
+      <w:r>
+        <w:rPr>
+          <w:color w:val="212121"/>
+        </w:rPr>
+        <w:t xml:space="preserve">L165: can you include site as a random factor if it only has two levels, or would this be better included as a fixed factor in the mixed effects model? </w:t>
+      </w:r>
+      <w:proofErr w:type="gramStart"/>
+      <w:r>
+        <w:rPr>
+          <w:color w:val="212121"/>
+        </w:rPr>
+        <w:t>Also</w:t>
+      </w:r>
+      <w:proofErr w:type="gramEnd"/>
+      <w:r>
+        <w:rPr>
+          <w:color w:val="212121"/>
+        </w:rPr>
+        <w:t xml:space="preserve"> because the two sites </w:t>
+      </w:r>
+      <w:r>
+        <w:rPr>
+          <w:color w:val="212121"/>
+        </w:rPr>
+        <w:lastRenderedPageBreak/>
+        <w:t>represent two different habitats (tallgrass vs shortgrass) it could be useful to have that as part of the main question as a fixed effect.</w:t>
+      </w:r>
+    </w:p>
+    <w:p>
+      <w:pPr>
+        <w:rPr>
+          <w:color w:val="212121"/>
+        </w:rPr>
+      </w:pPr>
+    </w:p>
+    <w:p>
+      <w:pPr>
+        <w:rPr>
+          <w:color w:val="212121"/>
+        </w:rPr>
+      </w:pPr>
+      <w:r>
+        <w:rPr>
+          <w:b/>
+          <w:color w:val="212121"/>
+        </w:rPr>
+        <w:t>Response:</w:t>
+      </w:r>
+      <w:r>
+        <w:rPr>
+          <w:color w:val="212121"/>
+        </w:rPr>
+        <w:t xml:space="preserve"> This is a stats philosophy question for sure, and you can run these models either way.  Because we only have two sites, we don’t feel comfortable making statements about these </w:t>
+      </w:r>
+      <w:r>
+        <w:rPr>
+          <w:color w:val="212121"/>
+        </w:rPr>
+        <w:t xml:space="preserve">ecosystems </w:t>
+      </w:r>
+      <w:r>
+        <w:rPr>
+          <w:color w:val="212121"/>
+        </w:rPr>
+        <w:t>specifically and would prefer to talk about the patterns broadly - thus leaving them as random effects.  However</w:t>
+      </w:r>
+      <w:r>
+        <w:rPr>
+          <w:color w:val="212121"/>
+        </w:rPr>
+        <w:t>,</w:t>
+      </w:r>
+      <w:r>
+        <w:rPr>
+          <w:color w:val="212121"/>
+        </w:rPr>
+        <w:t xml:space="preserve"> we tried running these models with site as a fixed effect and there are different levels of recovery between the two sites.  This is accounted for with site-level random intercepts now, but we would love to know how these rates of recovery vary across a larger number of sites and site factors!</w:t>
+      </w:r>
+    </w:p>
+    <w:p>
+      <w:pPr>
+        <w:rPr>
+          <w:color w:val="212121"/>
+        </w:rPr>
+      </w:pPr>
+    </w:p>
+    <w:p>
+      <w:pPr>
+        <w:rPr>
+          <w:color w:val="212121"/>
+        </w:rPr>
+      </w:pPr>
+    </w:p>
+    <w:p>
+      <w:pPr>
+        <w:rPr>
+          <w:color w:val="212121"/>
+        </w:rPr>
+      </w:pPr>
+      <w:r>
+        <w:rPr>
+          <w:b/>
+          <w:color w:val="212121"/>
+        </w:rPr>
+        <w:t xml:space="preserve">Comment: </w:t>
+      </w:r>
+      <w:r>
+        <w:rPr>
+          <w:color w:val="212121"/>
+        </w:rPr>
+        <w:t>L199: were there differences in seed loss between trap types? Maybe you could indicate here the observations of seed fragments that could be related to seed predation?</w:t>
+      </w:r>
+    </w:p>
+    <w:p>
+      <w:pPr>
+        <w:rPr>
+          <w:color w:val="212121"/>
+        </w:rPr>
+      </w:pPr>
+    </w:p>
+    <w:p>
+      <w:pPr>
+        <w:rPr>
+          <w:color w:val="212121"/>
+        </w:rPr>
+      </w:pPr>
+      <w:r>
+        <w:rPr>
+          <w:b/>
+          <w:color w:val="212121"/>
+        </w:rPr>
+        <w:t>Response:</w:t>
+      </w:r>
+      <w:r>
+        <w:rPr>
+          <w:color w:val="212121"/>
+        </w:rPr>
+        <w:t xml:space="preserve"> there were not differences in seed loss per trap type per time.  We did add the reference to the seed fragments and possible predation.</w:t>
+      </w:r>
+    </w:p>
+    <w:p>
+      <w:pPr>
+        <w:rPr>
+          <w:color w:val="212121"/>
+        </w:rPr>
+      </w:pPr>
+    </w:p>
+    <w:p>
+      <w:pPr>
+        <w:rPr>
+          <w:color w:val="212121"/>
+        </w:rPr>
+      </w:pPr>
+    </w:p>
+    <w:p>
+      <w:pPr>
+        <w:rPr>
+          <w:color w:val="212121"/>
+        </w:rPr>
+      </w:pPr>
+      <w:r>
+        <w:rPr>
+          <w:b/>
+          <w:color w:val="212121"/>
+        </w:rPr>
+        <w:t xml:space="preserve">Comment: </w:t>
+      </w:r>
+      <w:r>
+        <w:rPr>
+          <w:color w:val="212121"/>
+        </w:rPr>
+        <w:t>L217-220: see my comments above - given some of the limitations of artificial grass traps you mention, I think you should (definitively!) provide the reasons, but let the readers decide by themselves ;)</w:t>
+      </w:r>
+    </w:p>
+    <w:p>
+      <w:pPr>
+        <w:rPr>
+          <w:color w:val="212121"/>
+        </w:rPr>
+      </w:pPr>
+    </w:p>
+    <w:p>
+      <w:pPr>
+        <w:rPr>
+          <w:color w:val="212121"/>
+        </w:rPr>
+      </w:pPr>
+      <w:r>
+        <w:rPr>
+          <w:b/>
+          <w:color w:val="212121"/>
+        </w:rPr>
+        <w:t>Response:</w:t>
+      </w:r>
+      <w:r>
+        <w:rPr>
+          <w:color w:val="212121"/>
+        </w:rPr>
+        <w:t xml:space="preserve"> We agree!  We have now made this change (see Main Point #2 for details)</w:t>
+      </w:r>
+    </w:p>
+    <w:p>
+      <w:pPr>
+        <w:rPr>
+          <w:color w:val="212121"/>
+        </w:rPr>
+      </w:pPr>
+    </w:p>
+    <w:p>
+      <w:pPr>
+        <w:rPr>
+          <w:color w:val="212121"/>
+        </w:rPr>
+      </w:pPr>
+    </w:p>
+    <w:p>
+      <w:pPr>
+        <w:rPr>
+          <w:color w:val="212121"/>
+        </w:rPr>
+      </w:pPr>
+      <w:r>
+        <w:rPr>
+          <w:b/>
+          <w:color w:val="212121"/>
+        </w:rPr>
+        <w:t xml:space="preserve">Comment: </w:t>
+      </w:r>
+      <w:r>
+        <w:rPr>
+          <w:color w:val="212121"/>
+        </w:rPr>
+        <w:t>L224: does this then mean that artificial grass traps had 48% seed loss?</w:t>
+      </w:r>
+    </w:p>
+    <w:p>
+      <w:pPr>
+        <w:rPr>
+          <w:color w:val="212121"/>
+        </w:rPr>
+      </w:pPr>
+    </w:p>
+    <w:p>
+      <w:pPr>
+        <w:rPr>
+          <w:color w:val="212121"/>
+        </w:rPr>
+      </w:pPr>
+      <w:r>
+        <w:rPr>
+          <w:b/>
+          <w:color w:val="212121"/>
+        </w:rPr>
+        <w:t xml:space="preserve">Response: </w:t>
+      </w:r>
+      <w:r>
+        <w:rPr>
+          <w:color w:val="212121"/>
+        </w:rPr>
+        <w:t>yes, on average</w:t>
+      </w:r>
+    </w:p>
+    <w:p>
+      <w:pPr>
+        <w:rPr>
+          <w:color w:val="212121"/>
+        </w:rPr>
+      </w:pPr>
+    </w:p>
+    <w:p>
+      <w:pPr>
+        <w:rPr>
+          <w:color w:val="212121"/>
+        </w:rPr>
+      </w:pPr>
+    </w:p>
+    <w:p>
+      <w:pPr>
+        <w:rPr>
+          <w:color w:val="212121"/>
+        </w:rPr>
+      </w:pPr>
+      <w:r>
+        <w:rPr>
+          <w:b/>
+          <w:color w:val="212121"/>
+        </w:rPr>
+        <w:t xml:space="preserve">Comment: </w:t>
+      </w:r>
+      <w:r>
+        <w:rPr>
+          <w:color w:val="212121"/>
+        </w:rPr>
+        <w:t>L236: but maybe some of those non-recovered seeds are just washed away from the traps but stay close by and still contribute to the aboveground community? (not sure if this question makes a lot of sense?)</w:t>
+      </w:r>
+    </w:p>
+    <w:p>
+      <w:pPr>
+        <w:rPr>
+          <w:color w:val="212121"/>
+        </w:rPr>
+      </w:pPr>
+    </w:p>
+    <w:p>
+      <w:pPr>
+        <w:rPr>
+          <w:color w:val="212121"/>
+        </w:rPr>
+      </w:pPr>
+      <w:r>
+        <w:rPr>
+          <w:b/>
+          <w:color w:val="212121"/>
+        </w:rPr>
+        <w:t xml:space="preserve">Response: </w:t>
+      </w:r>
+      <w:r>
+        <w:rPr>
+          <w:color w:val="212121"/>
+        </w:rPr>
+        <w:t xml:space="preserve"> Yes, they totally could have!  Just not in the specific location where the trap is.    We’ve updated the statement to </w:t>
+      </w:r>
+      <w:r>
+        <w:rPr>
+          <w:color w:val="212121"/>
+        </w:rPr>
+        <w:t xml:space="preserve">better reflect our original intention of discussing effective dispersal, after accounting for </w:t>
+      </w:r>
+      <w:proofErr w:type="spellStart"/>
+      <w:r>
+        <w:rPr>
+          <w:color w:val="212121"/>
+        </w:rPr>
+        <w:t>granivory</w:t>
+      </w:r>
+      <w:proofErr w:type="spellEnd"/>
+      <w:r>
+        <w:rPr>
+          <w:color w:val="212121"/>
+        </w:rPr>
+        <w:t xml:space="preserve"> or secondary dispersal.</w:t>
+      </w:r>
+    </w:p>
+    <w:p>
+      <w:pPr>
+        <w:rPr>
+          <w:color w:val="212121"/>
+        </w:rPr>
+      </w:pPr>
+    </w:p>
+    <w:p>
+      <w:pPr>
+        <w:rPr>
+          <w:color w:val="212121"/>
+        </w:rPr>
+      </w:pPr>
+    </w:p>
+    <w:p>
+      <w:pPr>
+        <w:rPr>
+          <w:color w:val="212121"/>
+        </w:rPr>
+      </w:pPr>
+      <w:r>
+        <w:rPr>
+          <w:b/>
+          <w:color w:val="212121"/>
+        </w:rPr>
+        <w:t>Comment:</w:t>
+      </w:r>
+      <w:r>
+        <w:rPr>
+          <w:color w:val="212121"/>
+        </w:rPr>
+        <w:t xml:space="preserve"> L237-239: not sure I follow the logic here. Why is this only for artificial grass traps?</w:t>
+      </w:r>
+    </w:p>
+    <w:p>
+      <w:pPr>
+        <w:rPr>
+          <w:color w:val="212121"/>
+        </w:rPr>
+      </w:pPr>
+    </w:p>
+    <w:p>
+      <w:pPr>
+        <w:rPr>
+          <w:color w:val="212121"/>
+        </w:rPr>
+      </w:pPr>
+      <w:r>
+        <w:rPr>
+          <w:b/>
+          <w:color w:val="212121"/>
+        </w:rPr>
+        <w:t>Response:</w:t>
+      </w:r>
+      <w:r>
+        <w:rPr>
+          <w:color w:val="212121"/>
+        </w:rPr>
+        <w:t xml:space="preserve"> It’s true that some seeds were lost for sticky traps, just a lot less.  So that’s more of a measure of primary dispersal on sticky traps because if you assume anything that could get </w:t>
+      </w:r>
+      <w:r>
+        <w:rPr>
+          <w:color w:val="212121"/>
+        </w:rPr>
+        <w:lastRenderedPageBreak/>
+        <w:t>lost to the environment, does in artificial grass traps (because they are open to the environment) and so that’s the lower limit of what you’d expect in the area, then the sticky traps are a LOT higher.  It’s true they are not a perfect measure of primary dispersal, but they are a lot closer than the astroturf carpets.</w:t>
+      </w:r>
+    </w:p>
+    <w:p>
+      <w:pPr>
+        <w:rPr>
+          <w:color w:val="212121"/>
+        </w:rPr>
+      </w:pPr>
+    </w:p>
+    <w:p>
+      <w:pPr>
+        <w:rPr>
+          <w:color w:val="212121"/>
+        </w:rPr>
+      </w:pPr>
+      <w:r>
+        <w:rPr>
+          <w:b/>
+          <w:color w:val="212121"/>
+        </w:rPr>
+        <w:t xml:space="preserve">Comment: </w:t>
+      </w:r>
+      <w:r>
+        <w:rPr>
+          <w:color w:val="212121"/>
+        </w:rPr>
+        <w:t>L269: did you find evidence of artificial grass traps continuing to collect and store seeds?</w:t>
+      </w:r>
+    </w:p>
+    <w:p>
+      <w:pPr>
+        <w:rPr>
+          <w:color w:val="212121"/>
+        </w:rPr>
+      </w:pPr>
+    </w:p>
+    <w:p>
+      <w:pPr>
+        <w:rPr>
+          <w:color w:val="212121"/>
+        </w:rPr>
+      </w:pPr>
+      <w:r>
+        <w:rPr>
+          <w:b/>
+          <w:color w:val="212121"/>
+        </w:rPr>
+        <w:t xml:space="preserve">Response: </w:t>
+      </w:r>
+      <w:r>
+        <w:rPr>
+          <w:color w:val="212121"/>
+        </w:rPr>
         <w:t xml:space="preserve">Good question.  We did find that the astroturf carpets collected seeds that we did not initially place on the carpets </w:t>
       </w:r>
     </w:p>
@@ -3044,7 +3517,28 @@
       </w:r>
       <w:proofErr w:type="gramEnd"/>
       <w:r>
-        <w:t xml:space="preserve"> but we did not cite it here.  That has been updated.</w:t>
+        <w:t xml:space="preserve"> but we did not cite it here</w:t>
+      </w:r>
+      <w:r>
+        <w:t>, so it was initially easy to miss</w:t>
+      </w:r>
+      <w:r>
+        <w:t xml:space="preserve">.  </w:t>
+      </w:r>
+      <w:r>
+        <w:t xml:space="preserve">We now include a reference to </w:t>
+      </w:r>
+      <w:r>
+        <w:t xml:space="preserve">supplementary </w:t>
+      </w:r>
+      <w:r>
+        <w:t>figure</w:t>
+      </w:r>
+      <w:r>
+        <w:t xml:space="preserve"> S1</w:t>
+      </w:r>
+      <w:r>
+        <w:t>.</w:t>
       </w:r>
     </w:p>
     <w:p/>
@@ -3878,6 +4372,95 @@
       <w:szCs w:val="30"/>
     </w:rPr>
   </w:style>
+  <w:style w:type="paragraph" w:styleId="Revision">
+    <w:name w:val="Revision"/>
+    <w:hidden/>
+    <w:uiPriority w:val="99"/>
+    <w:semiHidden/>
+    <w:rsid w:val="00207A41"/>
+    <w:pPr>
+      <w:spacing w:line="240" w:lineRule="auto"/>
+    </w:pPr>
+  </w:style>
+  <w:style w:type="character" w:styleId="CommentReference">
+    <w:name w:val="annotation reference"/>
+    <w:basedOn w:val="DefaultParagraphFont"/>
+    <w:uiPriority w:val="99"/>
+    <w:semiHidden/>
+    <w:unhideWhenUsed/>
+    <w:rsid w:val="003F0EBC"/>
+    <w:rPr>
+      <w:sz w:val="16"/>
+      <w:szCs w:val="16"/>
+    </w:rPr>
+  </w:style>
+  <w:style w:type="paragraph" w:styleId="CommentText">
+    <w:name w:val="annotation text"/>
+    <w:basedOn w:val="Normal"/>
+    <w:link w:val="CommentTextChar"/>
+    <w:uiPriority w:val="99"/>
+    <w:semiHidden/>
+    <w:unhideWhenUsed/>
+    <w:rsid w:val="003F0EBC"/>
+    <w:pPr>
+      <w:spacing w:line="240" w:lineRule="auto"/>
+    </w:pPr>
+    <w:rPr>
+      <w:sz w:val="20"/>
+      <w:szCs w:val="20"/>
+    </w:rPr>
+  </w:style>
+  <w:style w:type="character" w:customStyle="1" w:styleId="CommentTextChar">
+    <w:name w:val="Comment Text Char"/>
+    <w:basedOn w:val="DefaultParagraphFont"/>
+    <w:link w:val="CommentText"/>
+    <w:uiPriority w:val="99"/>
+    <w:semiHidden/>
+    <w:rsid w:val="003F0EBC"/>
+    <w:rPr>
+      <w:sz w:val="20"/>
+      <w:szCs w:val="20"/>
+    </w:rPr>
+  </w:style>
+  <w:style w:type="paragraph" w:styleId="CommentSubject">
+    <w:name w:val="annotation subject"/>
+    <w:basedOn w:val="CommentText"/>
+    <w:next w:val="CommentText"/>
+    <w:link w:val="CommentSubjectChar"/>
+    <w:uiPriority w:val="99"/>
+    <w:semiHidden/>
+    <w:unhideWhenUsed/>
+    <w:rsid w:val="003F0EBC"/>
+    <w:rPr>
+      <w:b/>
+      <w:bCs/>
+    </w:rPr>
+  </w:style>
+  <w:style w:type="character" w:customStyle="1" w:styleId="CommentSubjectChar">
+    <w:name w:val="Comment Subject Char"/>
+    <w:basedOn w:val="CommentTextChar"/>
+    <w:link w:val="CommentSubject"/>
+    <w:uiPriority w:val="99"/>
+    <w:semiHidden/>
+    <w:rsid w:val="003F0EBC"/>
+    <w:rPr>
+      <w:b/>
+      <w:bCs/>
+      <w:sz w:val="20"/>
+      <w:szCs w:val="20"/>
+    </w:rPr>
+  </w:style>
+  <w:style w:type="paragraph" w:styleId="ListParagraph">
+    <w:name w:val="List Paragraph"/>
+    <w:basedOn w:val="Normal"/>
+    <w:uiPriority w:val="34"/>
+    <w:qFormat/>
+    <w:rsid w:val="0051756B"/>
+    <w:pPr>
+      <w:ind w:left="720"/>
+      <w:contextualSpacing/>
+    </w:pPr>
+  </w:style>
 </w:styles>
 </file>
 

</xml_diff>